<commit_message>
adding notebook lecture 2 and files structure
</commit_message>
<xml_diff>
--- a/assets/documents/26-udenar-big-data/plantilla-requerimientos-proyecto.docx
+++ b/assets/documents/26-udenar-big-data/plantilla-requerimientos-proyecto.docx
@@ -31,7 +31,7 @@
     </w:p>
     <w:p>
       <w:r>
-        <w:t>Grupo (G1…), integrantes, arquetipo (asignación de recursos | riesgo / alerta temprana | monitoreo), fecha.</w:t>
+        <w:t>Id del grupo, integrantes, arquetipo seleccionado (asignación de recursos | riesgo / alerta temprana | monitoreo).</w:t>
       </w:r>
     </w:p>
     <w:p/>
@@ -54,12 +54,12 @@
         <w:pStyle w:val="Heading2"/>
       </w:pPr>
       <w:r>
-        <w:t>3. Pregunta de decisión</w:t>
+        <w:t>3. Requerimientos del proyecto</w:t>
       </w:r>
     </w:p>
     <w:p>
       <w:r>
-        <w:t>Una pregunta específica, respondible con microdatos GEIH, alineada con el arquetipo.</w:t>
+        <w:t>Liste los requerimientos del proyecto que se deben satisfacer para el éxito del proyecto.</w:t>
       </w:r>
     </w:p>
     <w:p/>
@@ -68,12 +68,12 @@
         <w:pStyle w:val="Heading2"/>
       </w:pPr>
       <w:r>
-        <w:t>4. Subconjunto de datos (GEIH)</w:t>
+        <w:t>4. Objetivos</w:t>
       </w:r>
     </w:p>
     <w:p>
       <w:r>
-        <w:t>Años (p. ej. 2022–2025), regiones/departamentos, segmento de población, variables principales.</w:t>
+        <w:t>Liste los objetivos del proyecto y explique por qué son relevantes.</w:t>
       </w:r>
     </w:p>
     <w:p/>
@@ -82,12 +82,12 @@
         <w:pStyle w:val="Heading2"/>
       </w:pPr>
       <w:r>
-        <w:t>5. Criterios de éxito</w:t>
+        <w:t>5. Subconjunto de datos (GEIH)</w:t>
       </w:r>
     </w:p>
     <w:p>
       <w:r>
-        <w:t>Al menos dos criterios comprobables (reproducibilidad, tiempo, incertidumbre, etc.).</w:t>
+        <w:t>Describa las variables del dataset GEIH que usted considera utilizar en su proyecto. Por ejemplo, años (p. ej. 2022–2025), regiones/departamentos, segmento de población, variables principales, etc.</w:t>
       </w:r>
     </w:p>
     <w:p/>
@@ -96,12 +96,12 @@
         <w:pStyle w:val="Heading2"/>
       </w:pPr>
       <w:r>
-        <w:t>6. Preocupación ética y lectura</w:t>
+        <w:t>6. Preocupaciones éticas</w:t>
       </w:r>
     </w:p>
     <w:p>
       <w:r>
-        <w:t>Un tema concreto del case shell §6 + cite Zuboff cap. 1 u otra lectura de la semana por nombre.</w:t>
+        <w:t>Liste los temas éticos que se relacionan con el proyecto y explique por qué son relevantes.</w:t>
       </w:r>
     </w:p>
     <w:p/>
@@ -115,7 +115,7 @@
     </w:p>
     <w:p>
       <w:r>
-        <w:t>Una viñeta por integrante (marco, datos, análisis, escritura, presentación).</w:t>
+        <w:t>Una viñeta por integrante (Marco de trabajo, Datos, Análisis, Escritura, Presentación).</w:t>
       </w:r>
     </w:p>
     <w:p/>
@@ -129,7 +129,7 @@
     </w:p>
     <w:p>
       <w:r>
-        <w:t>Inserte su figura (architecture.svg) y 3–5 oraciones: fuentes → almacenamiento → procesamiento → decisión.</w:t>
+        <w:t>Inserte una figura que muestre el pipeline del proyecto y 3–5 oraciones que lo describan. Ejemplo: fuentes → almacenamiento → procesamiento → decisión.</w:t>
       </w:r>
     </w:p>
     <w:p/>
@@ -138,26 +138,12 @@
         <w:pStyle w:val="Heading2"/>
       </w:pPr>
       <w:r>
-        <w:t>9. URL del Colab grupal canónico</w:t>
+        <w:t>9. Rotación de liderazgo para su grupo por semana</w:t>
       </w:r>
     </w:p>
     <w:p>
       <w:r>
-        <w:t>Enlace al Colab/Drive donde el grupo ejecuta l1-introduction-group y consolida tareas.</w:t>
-      </w:r>
-    </w:p>
-    <w:p/>
-    <w:p>
-      <w:pPr>
-        <w:pStyle w:val="Heading2"/>
-      </w:pPr>
-      <w:r>
-        <w:t>10. Rotación de escriba por lección</w:t>
-      </w:r>
-    </w:p>
-    <w:p>
-      <w:r>
-        <w:t>L1: … L2: … … L6: … (cada integrante al menos una vez).</w:t>
+        <w:t>S1: … S2: … S3: … S4: … (cada integrante debe liderar al menos una vez por semana).</w:t>
       </w:r>
     </w:p>
     <w:p/>

</xml_diff>